<commit_message>
Changes related to EHIS-3279
</commit_message>
<xml_diff>
--- a/PHOCS-Docgentemplates/PHOCSInvoiceBCCDC.docx
+++ b/PHOCS-Docgentemplates/PHOCSInvoiceBCCDC.docx
@@ -8,7 +8,7 @@
           <w:noProof/>
         </w:rPr>
         <w:drawing>
-          <wp:anchor distT="0" distB="0" distL="114300" distR="114300" simplePos="0" relativeHeight="251658242" behindDoc="0" locked="0" layoutInCell="1" allowOverlap="1" wp14:anchorId="3B2EF097" wp14:editId="4C99D2D1">
+          <wp:anchor distT="0" distB="0" distL="114300" distR="114300" simplePos="0" relativeHeight="251658242" behindDoc="0" locked="0" layoutInCell="1" allowOverlap="1" wp14:anchorId="3B2EF097" wp14:editId="2C102635">
             <wp:simplePos x="0" y="0"/>
             <wp:positionH relativeFrom="rightMargin">
               <wp:align>left</wp:align>
@@ -276,7 +276,16 @@
                 <w:sz w:val="20"/>
                 <w:szCs w:val="20"/>
               </w:rPr>
-              <w:t>Account #:</w:t>
+              <w:t>Account #</w:t>
+            </w:r>
+            <w:r>
+              <w:rPr>
+                <w:b/>
+                <w:bCs/>
+                <w:sz w:val="20"/>
+                <w:szCs w:val="20"/>
+              </w:rPr>
+              <w:t>:</w:t>
             </w:r>
             <w:r>
               <w:rPr>
@@ -290,7 +299,7 @@
                 <w:sz w:val="20"/>
                 <w:szCs w:val="20"/>
               </w:rPr>
-              <w:t xml:space="preserve"> </w:t>
+              <w:t>{</w:t>
             </w:r>
             <w:r>
               <w:rPr>
@@ -298,7 +307,7 @@
                 <w:szCs w:val="20"/>
                 <w:lang w:val="en-CA"/>
               </w:rPr>
-              <w:t>{{</w:t>
+              <w:t>{</w:t>
             </w:r>
             <w:proofErr w:type="spellStart"/>
             <w:r>
@@ -352,22 +361,6 @@
               <w:rPr>
                 <w:sz w:val="20"/>
                 <w:szCs w:val="20"/>
-              </w:rPr>
-              <w:t xml:space="preserve"> </w:t>
-            </w:r>
-            <w:r>
-              <w:rPr>
-                <w:sz w:val="20"/>
-                <w:szCs w:val="20"/>
-              </w:rPr>
-              <w:t xml:space="preserve"> </w:t>
-            </w:r>
-            <w:r>
-              <w:rPr>
-                <w:kern w:val="0"/>
-                <w:sz w:val="20"/>
-                <w:szCs w:val="20"/>
-                <w14:ligatures w14:val="none"/>
               </w:rPr>
               <w:t xml:space="preserve"> </w:t>
             </w:r>
@@ -436,14 +429,14 @@
                 <w:szCs w:val="20"/>
                 <w14:ligatures w14:val="none"/>
               </w:rPr>
-              <w:t xml:space="preserve"> </w:t>
-            </w:r>
-            <w:r>
-              <w:rPr>
-                <w:sz w:val="20"/>
-                <w:szCs w:val="20"/>
-              </w:rPr>
-              <w:t>{{</w:t>
+              <w:t>{</w:t>
+            </w:r>
+            <w:r>
+              <w:rPr>
+                <w:sz w:val="20"/>
+                <w:szCs w:val="20"/>
+              </w:rPr>
+              <w:t>{</w:t>
             </w:r>
             <w:proofErr w:type="spellStart"/>
             <w:r>
@@ -489,7 +482,16 @@
                 <w:sz w:val="20"/>
                 <w:szCs w:val="20"/>
               </w:rPr>
-              <w:t>Invoice Date:</w:t>
+              <w:t>Invoice Date</w:t>
+            </w:r>
+            <w:r>
+              <w:rPr>
+                <w:b/>
+                <w:bCs/>
+                <w:sz w:val="20"/>
+                <w:szCs w:val="20"/>
+              </w:rPr>
+              <w:t>:</w:t>
             </w:r>
             <w:r>
               <w:rPr>
@@ -504,13 +506,6 @@
                 <w:sz w:val="20"/>
                 <w:szCs w:val="20"/>
                 <w14:ligatures w14:val="none"/>
-              </w:rPr>
-              <w:t xml:space="preserve"> </w:t>
-            </w:r>
-            <w:r>
-              <w:rPr>
-                <w:sz w:val="20"/>
-                <w:szCs w:val="20"/>
               </w:rPr>
               <w:t>{</w:t>
             </w:r>
@@ -552,10 +547,8 @@
           <w:p>
             <w:pPr>
               <w:rPr>
-                <w:kern w:val="0"/>
-                <w:sz w:val="20"/>
-                <w:szCs w:val="20"/>
-                <w14:ligatures w14:val="none"/>
+                <w:sz w:val="20"/>
+                <w:szCs w:val="20"/>
               </w:rPr>
             </w:pPr>
             <w:r>
@@ -641,45 +634,6 @@
                 <w:szCs w:val="20"/>
               </w:rPr>
               <w:t>AccountPhysicalAddressCity</w:t>
-            </w:r>
-            <w:proofErr w:type="spellEnd"/>
-            <w:r>
-              <w:rPr>
-                <w:sz w:val="20"/>
-                <w:szCs w:val="20"/>
-              </w:rPr>
-              <w:t>}}</w:t>
-            </w:r>
-            <w:r>
-              <w:rPr>
-                <w:sz w:val="20"/>
-                <w:szCs w:val="20"/>
-              </w:rPr>
-              <w:t>,</w:t>
-            </w:r>
-            <w:r>
-              <w:rPr>
-                <w:kern w:val="0"/>
-                <w:sz w:val="20"/>
-                <w:szCs w:val="20"/>
-                <w14:ligatures w14:val="none"/>
-              </w:rPr>
-              <w:t xml:space="preserve"> </w:t>
-            </w:r>
-            <w:r>
-              <w:rPr>
-                <w:sz w:val="20"/>
-                <w:szCs w:val="20"/>
-              </w:rPr>
-              <w:t>{{</w:t>
-            </w:r>
-            <w:proofErr w:type="spellStart"/>
-            <w:r>
-              <w:rPr>
-                <w:sz w:val="20"/>
-                <w:szCs w:val="20"/>
-              </w:rPr>
-              <w:t>AccountPhysicalAddressStateCode</w:t>
             </w:r>
             <w:proofErr w:type="spellEnd"/>
             <w:r>
@@ -693,12 +647,128 @@
           <w:p>
             <w:pPr>
               <w:rPr>
+                <w:sz w:val="20"/>
+                <w:szCs w:val="20"/>
+              </w:rPr>
+            </w:pPr>
+            <w:r>
+              <w:rPr>
+                <w:sz w:val="20"/>
+                <w:szCs w:val="20"/>
+              </w:rPr>
+              <w:t>{{</w:t>
+            </w:r>
+            <w:proofErr w:type="spellStart"/>
+            <w:r>
+              <w:rPr>
+                <w:sz w:val="20"/>
+                <w:szCs w:val="20"/>
+              </w:rPr>
+              <w:t>AccountPhysicalAddressStateCode</w:t>
+            </w:r>
+            <w:proofErr w:type="spellEnd"/>
+            <w:r>
+              <w:rPr>
+                <w:sz w:val="20"/>
+                <w:szCs w:val="20"/>
+              </w:rPr>
+              <w:t>}}</w:t>
+            </w:r>
+          </w:p>
+          <w:p>
+            <w:pPr>
+              <w:rPr>
+                <w:kern w:val="0"/>
+                <w:sz w:val="20"/>
+                <w:szCs w:val="20"/>
+                <w14:ligatures w14:val="none"/>
+              </w:rPr>
+            </w:pPr>
+            <w:r>
+              <w:rPr>
+                <w:kern w:val="0"/>
+                <w:sz w:val="20"/>
+                <w:szCs w:val="20"/>
+                <w14:ligatures w14:val="none"/>
+              </w:rPr>
+              <w:t>{{</w:t>
+            </w:r>
+            <w:proofErr w:type="spellStart"/>
+            <w:r>
+              <w:rPr>
+                <w:kern w:val="0"/>
+                <w:sz w:val="20"/>
+                <w:szCs w:val="20"/>
+                <w14:ligatures w14:val="none"/>
+              </w:rPr>
+              <w:t>AccountPhysicalAddressPostalCode</w:t>
+            </w:r>
+            <w:proofErr w:type="spellEnd"/>
+            <w:r>
+              <w:rPr>
+                <w:kern w:val="0"/>
+                <w:sz w:val="20"/>
+                <w:szCs w:val="20"/>
+                <w14:ligatures w14:val="none"/>
+              </w:rPr>
+              <w:t>}}</w:t>
+            </w:r>
+          </w:p>
+          <w:p>
+            <w:pPr>
+              <w:rPr>
+                <w:sz w:val="20"/>
+                <w:szCs w:val="20"/>
+              </w:rPr>
+            </w:pPr>
+            <w:r>
+              <w:rPr>
+                <w:sz w:val="20"/>
+                <w:szCs w:val="20"/>
+              </w:rPr>
+              <w:t>{{</w:t>
+            </w:r>
+            <w:proofErr w:type="spellStart"/>
+            <w:r>
+              <w:rPr>
+                <w:sz w:val="20"/>
+                <w:szCs w:val="20"/>
+              </w:rPr>
+              <w:t>AccountPhysicalAddressCountryCode</w:t>
+            </w:r>
+            <w:proofErr w:type="spellEnd"/>
+            <w:r>
+              <w:rPr>
+                <w:sz w:val="20"/>
+                <w:szCs w:val="20"/>
+              </w:rPr>
+              <w:t>}}</w:t>
+            </w:r>
+            <w:r>
+              <w:rPr>
+                <w:sz w:val="20"/>
+                <w:szCs w:val="20"/>
+              </w:rPr>
+              <w:t xml:space="preserve"> </w:t>
+            </w:r>
+          </w:p>
+          <w:p>
+            <w:pPr>
+              <w:rPr>
                 <w:b/>
                 <w:bCs/>
                 <w:sz w:val="20"/>
                 <w:szCs w:val="20"/>
               </w:rPr>
             </w:pPr>
+          </w:p>
+          <w:p>
+            <w:pPr>
+              <w:rPr>
+                <w:sz w:val="20"/>
+                <w:szCs w:val="20"/>
+              </w:rPr>
+            </w:pPr>
             <w:r>
               <w:rPr>
                 <w:sz w:val="20"/>
@@ -712,7 +782,7 @@
                 <w:sz w:val="20"/>
                 <w:szCs w:val="20"/>
               </w:rPr>
-              <w:t>AccountPhysicalAddressCountryCode</w:t>
+              <w:t>BillingContactEmail</w:t>
             </w:r>
             <w:proofErr w:type="spellEnd"/>
             <w:r>
@@ -722,36 +792,16 @@
               </w:rPr>
               <w:t>}}</w:t>
             </w:r>
-            <w:r>
-              <w:rPr>
-                <w:sz w:val="20"/>
-                <w:szCs w:val="20"/>
-              </w:rPr>
-              <w:t xml:space="preserve"> - </w:t>
-            </w:r>
-            <w:r>
-              <w:rPr>
-                <w:sz w:val="20"/>
-                <w:szCs w:val="20"/>
-              </w:rPr>
-              <w:t>{{</w:t>
-            </w:r>
-            <w:proofErr w:type="spellStart"/>
-            <w:r>
-              <w:rPr>
-                <w:sz w:val="20"/>
-                <w:szCs w:val="20"/>
-              </w:rPr>
-              <w:t>AccountPhysicalAddressPostalCode</w:t>
-            </w:r>
-            <w:proofErr w:type="spellEnd"/>
-            <w:r>
-              <w:rPr>
-                <w:sz w:val="20"/>
-                <w:szCs w:val="20"/>
-              </w:rPr>
-              <w:t>}}</w:t>
-            </w:r>
+          </w:p>
+          <w:p>
+            <w:pPr>
+              <w:rPr>
+                <w:b/>
+                <w:bCs/>
+                <w:sz w:val="20"/>
+                <w:szCs w:val="20"/>
+              </w:rPr>
+            </w:pPr>
           </w:p>
         </w:tc>
       </w:tr>
@@ -4539,15 +4589,6 @@
 </file>
 
 <file path=customXml/item1.xml><?xml version="1.0" encoding="utf-8"?>
-<?mso-contentType ?>
-<FormTemplates xmlns="http://schemas.microsoft.com/sharepoint/v3/contenttype/forms">
-  <Display>DocumentLibraryForm</Display>
-  <Edit>DocumentLibraryForm</Edit>
-  <New>DocumentLibraryForm</New>
-</FormTemplates>
-</file>
-
-<file path=customXml/item2.xml><?xml version="1.0" encoding="utf-8"?>
 <p:properties xmlns:p="http://schemas.microsoft.com/office/2006/metadata/properties" xmlns:xsi="http://www.w3.org/2001/XMLSchema-instance" xmlns:pc="http://schemas.microsoft.com/office/infopath/2007/PartnerControls">
   <documentManagement>
     <lcf76f155ced4ddcb4097134ff3c332f xmlns="94d5cf59-5162-48bc-aa9b-620df72947f5">
@@ -4556,6 +4597,15 @@
     <TaxCatchAll xmlns="8350b7c0-334b-4e19-bfc1-744f6a979eee" xsi:nil="true"/>
   </documentManagement>
 </p:properties>
+</file>
+
+<file path=customXml/item2.xml><?xml version="1.0" encoding="utf-8"?>
+<?mso-contentType ?>
+<FormTemplates xmlns="http://schemas.microsoft.com/sharepoint/v3/contenttype/forms">
+  <Display>DocumentLibraryForm</Display>
+  <Edit>DocumentLibraryForm</Edit>
+  <New>DocumentLibraryForm</New>
+</FormTemplates>
 </file>
 
 <file path=customXml/item3.xml><?xml version="1.0" encoding="utf-8"?>
@@ -4754,20 +4804,20 @@
 </file>
 
 <file path=customXml/itemProps1.xml><?xml version="1.0" encoding="utf-8"?>
-<ds:datastoreItem xmlns:ds="http://schemas.openxmlformats.org/officeDocument/2006/customXml" ds:itemID="{4B128C7F-9F39-4DC8-B35E-3209341C778A}">
-  <ds:schemaRefs>
-    <ds:schemaRef ds:uri="http://schemas.microsoft.com/sharepoint/v3/contenttype/forms"/>
-  </ds:schemaRefs>
-</ds:datastoreItem>
-</file>
-
-<file path=customXml/itemProps2.xml><?xml version="1.0" encoding="utf-8"?>
 <ds:datastoreItem xmlns:ds="http://schemas.openxmlformats.org/officeDocument/2006/customXml" ds:itemID="{88C65EE0-E775-445E-8D2F-618094454501}">
   <ds:schemaRefs>
     <ds:schemaRef ds:uri="http://schemas.microsoft.com/office/2006/metadata/properties"/>
     <ds:schemaRef ds:uri="http://schemas.microsoft.com/office/infopath/2007/PartnerControls"/>
     <ds:schemaRef ds:uri="94d5cf59-5162-48bc-aa9b-620df72947f5"/>
     <ds:schemaRef ds:uri="8350b7c0-334b-4e19-bfc1-744f6a979eee"/>
+  </ds:schemaRefs>
+</ds:datastoreItem>
+</file>
+
+<file path=customXml/itemProps2.xml><?xml version="1.0" encoding="utf-8"?>
+<ds:datastoreItem xmlns:ds="http://schemas.openxmlformats.org/officeDocument/2006/customXml" ds:itemID="{4B128C7F-9F39-4DC8-B35E-3209341C778A}">
+  <ds:schemaRefs>
+    <ds:schemaRef ds:uri="http://schemas.microsoft.com/sharepoint/v3/contenttype/forms"/>
   </ds:schemaRefs>
 </ds:datastoreItem>
 </file>

</xml_diff>